<commit_message>
Trust invoice-prefixed material filenames
</commit_message>
<xml_diff>
--- a/docs/文件自动归类助手_使用说明_20260528.docx
+++ b/docs/文件自动归类助手_使用说明_20260528.docx
@@ -127,6 +127,78 @@
           <w:rFonts w:ascii="Calibri" w:hAnsi="Calibri" w:eastAsia="Microsoft YaHei"/>
         </w:rPr>
         <w:t>其中采购合同不是必需材料；其余材料用于齐套判断和闭环校验。</w:t>
+      </w:r>
+    </w:p>
+    <w:p>
+      <w:pPr>
+        <w:pStyle w:val="Heading1"/>
+      </w:pPr>
+      <w:r>
+        <w:t>文件名直接通过规则</w:t>
+      </w:r>
+    </w:p>
+    <w:p>
+      <w:pPr/>
+      <w:r>
+        <w:t>除采购合同外，如果文件名是“当前发票号 + 材料标准名”，软件会直接按对应材料识别，不再等待 OCR 读出正文。</w:t>
+      </w:r>
+    </w:p>
+    <w:p>
+      <w:pPr/>
+      <w:r>
+        <w:t>当前支持两种写法：</w:t>
+      </w:r>
+    </w:p>
+    <w:p>
+      <w:pPr>
+        <w:pStyle w:val="CodeBlock"/>
+      </w:pPr>
+      <w:r>
+        <w:t>LY25112112装箱单.jpg</w:t>
+        <w:br/>
+        <w:t>25112112装箱单.jpg</w:t>
+      </w:r>
+    </w:p>
+    <w:p>
+      <w:pPr/>
+      <w:r>
+        <w:t>同样适用于外销、报关委托书、报关费发票、提单、装箱单、运费发票，例如：</w:t>
+      </w:r>
+    </w:p>
+    <w:p>
+      <w:pPr>
+        <w:pStyle w:val="CodeBlock"/>
+      </w:pPr>
+      <w:r>
+        <w:t>25112112外销.pdf</w:t>
+        <w:br/>
+        <w:t>25112112报关委托书.pdf</w:t>
+        <w:br/>
+        <w:t>25112112报关费发票.pdf</w:t>
+        <w:br/>
+        <w:t>25112112提单.pdf</w:t>
+        <w:br/>
+        <w:t>25112112装箱单.jpg</w:t>
+        <w:br/>
+        <w:t>25112112运费发票.pdf</w:t>
+      </w:r>
+    </w:p>
+    <w:p>
+      <w:pPr/>
+      <w:r>
+        <w:t>文件名前面的数字必须能对应当前票的发票号。25112113装箱单.jpg 放到 LY25112112 这一票下时，不会按这条规则自动通过。</w:t>
+      </w:r>
+    </w:p>
+    <w:p>
+      <w:pPr/>
+      <w:r>
+        <w:t>材料名后面不要再加其他说明。25112112装箱单.jpg 可以直接通过，25112112装箱单补充.jpg 仍会进入复核。</w:t>
+      </w:r>
+    </w:p>
+    <w:p>
+      <w:pPr/>
+      <w:r>
+        <w:t>采购合同不使用这条规则。采购合同通常来自扫描仪软件导出的统一格式，仍按原有采购合同文件名规则识别。</w:t>
       </w:r>
     </w:p>
     <w:p>

</xml_diff>